<commit_message>
writing: retain explicit serif typography in Word exports
</commit_message>
<xml_diff>
--- a/writing/checking-the-machines/downloads/An-Open-Letter-on-Checking-the-Machines.docx
+++ b/writing/checking-the-machines/downloads/An-Open-Letter-on-Checking-the-Machines.docx
@@ -1292,7 +1292,7 @@
       <w:spacing w:line="278" w:lineRule="auto" w:after="160"/>
     </w:pPr>
     <w:rPr>
-      <w:rFonts w:ascii="Times New Roman" w:hAnsi="Times New Roman"/>
+      <w:rFonts w:ascii="Times New Roman" w:hAnsi="Times New Roman" w:eastAsia="Times New Roman" w:cs="Times New Roman"/>
       <w:sz w:val="23"/>
       <w:lang w:val="en-US"/>
     </w:rPr>
@@ -1356,7 +1356,7 @@
       <w:outlineLvl w:val="0"/>
     </w:pPr>
     <w:rPr>
-      <w:rFonts w:asciiTheme="majorHAnsi" w:eastAsiaTheme="majorEastAsia" w:hAnsiTheme="majorHAnsi" w:cstheme="majorBidi" w:ascii="Times New Roman" w:hAnsi="Times New Roman"/>
+      <w:rFonts w:ascii="Times New Roman" w:hAnsi="Times New Roman" w:eastAsia="Times New Roman" w:cs="Times New Roman"/>
       <w:b/>
       <w:bCs/>
       <w:color w:val="191919"/>
@@ -1380,7 +1380,7 @@
       <w:outlineLvl w:val="1"/>
     </w:pPr>
     <w:rPr>
-      <w:rFonts w:asciiTheme="majorHAnsi" w:eastAsiaTheme="majorEastAsia" w:hAnsiTheme="majorHAnsi" w:cstheme="majorBidi" w:ascii="Times New Roman" w:hAnsi="Times New Roman"/>
+      <w:rFonts w:ascii="Times New Roman" w:hAnsi="Times New Roman" w:eastAsia="Times New Roman" w:cs="Times New Roman"/>
       <w:b/>
       <w:bCs/>
       <w:color w:val="191919"/>
@@ -1639,14 +1639,11 @@
     <w:rsid w:val="00FC693F"/>
     <w:pPr>
       <w:keepNext/>
-      <w:pBdr>
-        <w:bottom w:val="single" w:sz="8" w:space="4" w:color="4F81BD" w:themeColor="accent1"/>
-      </w:pBdr>
       <w:spacing w:after="160" w:line="240" w:lineRule="auto" w:before="240"/>
       <w:contextualSpacing/>
     </w:pPr>
     <w:rPr>
-      <w:rFonts w:asciiTheme="majorHAnsi" w:eastAsiaTheme="majorEastAsia" w:hAnsiTheme="majorHAnsi" w:cstheme="majorBidi" w:ascii="Times New Roman" w:hAnsi="Times New Roman"/>
+      <w:rFonts w:ascii="Times New Roman" w:hAnsi="Times New Roman" w:eastAsia="Times New Roman" w:cs="Times New Roman"/>
       <w:b/>
       <w:color w:val="191919"/>
       <w:spacing w:val="5"/>

</xml_diff>